<commit_message>
lore: add the new details from the 20 single chapters, without the phoenixes
</commit_message>
<xml_diff>
--- a/src/atlas/data/lore/Okkult-Lore.docx
+++ b/src/atlas/data/lore/Okkult-Lore.docx
@@ -54,6 +54,17 @@
       </w:r>
     </w:p>
     <w:p>
+      <w:pPr>
+        <w:pStyle w:val="ListBullet"/>
+      </w:pPr>
+      <w:r>
+        <w:rPr>
+          <w:highlight w:val="magenta"/>
+        </w:rPr>
+        <w:t>Rosa: neu aus den 20 Einzelkapiteln vom 22.09.2026 (ohne Phönixe)</w:t>
+      </w:r>
+    </w:p>
+    <w:p>
       <w:r>
         <w:t>Die Markierungen dienen nur der Prüfung. Wo eine Ergänzung doppelt ist, kann sie gestrichen werden. Sind alle geprüft, kann die Markierung entfernt werden – ATLAS liest den Text mit oder ohne Farbe gleich.</w:t>
       </w:r>
@@ -1757,6 +1768,27 @@
       </w:r>
     </w:p>
     <w:p>
+      <w:r>
+        <w:rPr>
+          <w:b/>
+          <w:highlight w:val="magenta"/>
+        </w:rPr>
+        <w:t>Theorie:</w:t>
+      </w:r>
+      <w:r>
+        <w:rPr>
+          <w:highlight w:val="magenta"/>
+        </w:rPr>
+        <w:t xml:space="preserve"> </w:t>
+      </w:r>
+      <w:r>
+        <w:rPr>
+          <w:highlight w:val="magenta"/>
+        </w:rPr>
+        <w:t>Eine Theorie behauptet, dass dort nichts altert oder sich verändert und Nahrung sowie Wasser unnötig seien.</w:t>
+      </w:r>
+    </w:p>
+    <w:p>
       <w:pPr>
         <w:pStyle w:val="Heading2"/>
       </w:pPr>
@@ -1791,6 +1823,14 @@
       </w:r>
     </w:p>
     <w:p>
+      <w:r>
+        <w:rPr>
+          <w:highlight w:val="magenta"/>
+        </w:rPr>
+        <w:t>In einem anderen Zeitlinienfall verschwand eine in der Zukunft erworbene Krankheit nach der Rückkehr, was jedoch nicht als allgemeine Zeitreise-Regel gelten darf.</w:t>
+      </w:r>
+    </w:p>
+    <w:p>
       <w:pPr>
         <w:pStyle w:val="Heading3"/>
       </w:pPr>
@@ -1914,6 +1954,14 @@
       </w:r>
     </w:p>
     <w:p>
+      <w:pPr>
+        <w:pStyle w:val="Heading4"/>
+      </w:pPr>
+      <w:r>
+        <w:t>Reguläre Portale</w:t>
+      </w:r>
+    </w:p>
+    <w:p>
       <w:r>
         <w:rPr>
           <w:highlight w:val="yellow"/>
@@ -1922,6 +1970,14 @@
       </w:r>
     </w:p>
     <w:p>
+      <w:pPr>
+        <w:pStyle w:val="Heading4"/>
+      </w:pPr>
+      <w:r>
+        <w:t>Instabile und temporäre Portale</w:t>
+      </w:r>
+    </w:p>
+    <w:p>
       <w:r>
         <w:rPr>
           <w:highlight w:val="yellow"/>
@@ -2021,6 +2077,14 @@
     </w:p>
     <w:p>
       <w:pPr>
+        <w:pStyle w:val="Heading4"/>
+      </w:pPr>
+      <w:r>
+        <w:t>Aufgaben</w:t>
+      </w:r>
+    </w:p>
+    <w:p>
+      <w:pPr>
         <w:pStyle w:val="ListBullet"/>
       </w:pPr>
       <w:r>
@@ -2169,6 +2233,14 @@
       </w:r>
     </w:p>
     <w:p>
+      <w:pPr>
+        <w:pStyle w:val="Heading4"/>
+      </w:pPr>
+      <w:r>
+        <w:t>Schutz von Wissen</w:t>
+      </w:r>
+    </w:p>
+    <w:p>
       <w:r>
         <w:rPr>
           <w:highlight w:val="yellow"/>
@@ -2190,6 +2262,14 @@
       </w:r>
     </w:p>
     <w:p>
+      <w:pPr>
+        <w:pStyle w:val="Heading4"/>
+      </w:pPr>
+      <w:r>
+        <w:t>Okkulte Vorgänge in gewöhnlichen Institutionen</w:t>
+      </w:r>
+    </w:p>
+    <w:p>
       <w:r>
         <w:rPr>
           <w:highlight w:val="yellow"/>
@@ -2295,6 +2375,14 @@
       </w:r>
     </w:p>
     <w:p>
+      <w:pPr>
+        <w:pStyle w:val="Heading4"/>
+      </w:pPr>
+      <w:r>
+        <w:t>Magische Gerichte</w:t>
+      </w:r>
+    </w:p>
+    <w:p>
       <w:r>
         <w:rPr>
           <w:highlight w:val="yellow"/>
@@ -2421,6 +2509,14 @@
       </w:r>
     </w:p>
     <w:p>
+      <w:pPr>
+        <w:pStyle w:val="Heading4"/>
+      </w:pPr>
+      <w:r>
+        <w:t>Kreaturenkunde</w:t>
+      </w:r>
+    </w:p>
+    <w:p>
       <w:r>
         <w:rPr>
           <w:highlight w:val="yellow"/>
@@ -2493,6 +2589,14 @@
       </w:r>
     </w:p>
     <w:p>
+      <w:pPr>
+        <w:pStyle w:val="Heading4"/>
+      </w:pPr>
+      <w:r>
+        <w:t>Seuchenbekämpfung</w:t>
+      </w:r>
+    </w:p>
+    <w:p>
       <w:r>
         <w:rPr>
           <w:highlight w:val="yellow"/>
@@ -2590,6 +2694,14 @@
       </w:r>
     </w:p>
     <w:p>
+      <w:r>
+        <w:rPr>
+          <w:highlight w:val="magenta"/>
+        </w:rPr>
+        <w:t>Sie arbeiten nicht ausschliesslich innerhalb Bloodmoon Valleys, sondern können auch in anderen Welten eingesetzt werden.</w:t>
+      </w:r>
+    </w:p>
+    <w:p>
       <w:pPr>
         <w:pStyle w:val="Heading3"/>
       </w:pPr>
@@ -2695,6 +2807,14 @@
       </w:r>
     </w:p>
     <w:p>
+      <w:pPr>
+        <w:pStyle w:val="Heading4"/>
+      </w:pPr>
+      <w:r>
+        <w:t>Magische Begabung und wer Magie nutzen kann</w:t>
+      </w:r>
+    </w:p>
+    <w:p>
       <w:r>
         <w:rPr>
           <w:highlight w:val="yellow"/>
@@ -2795,6 +2915,14 @@
       </w:r>
     </w:p>
     <w:p>
+      <w:pPr>
+        <w:pStyle w:val="Heading4"/>
+      </w:pPr>
+      <w:r>
+        <w:t>Energie und Mana</w:t>
+      </w:r>
+    </w:p>
+    <w:p>
       <w:r>
         <w:rPr>
           <w:highlight w:val="yellow"/>
@@ -3334,6 +3462,14 @@
       </w:r>
     </w:p>
     <w:p>
+      <w:pPr>
+        <w:pStyle w:val="Heading4"/>
+      </w:pPr>
+      <w:r>
+        <w:t>Verwandlung anderer Wesen</w:t>
+      </w:r>
+    </w:p>
+    <w:p>
       <w:r>
         <w:rPr>
           <w:highlight w:val="yellow"/>
@@ -3535,6 +3671,14 @@
       </w:r>
     </w:p>
     <w:p>
+      <w:pPr>
+        <w:pStyle w:val="Heading4"/>
+      </w:pPr>
+      <w:r>
+        <w:t>Regeln und Folgen</w:t>
+      </w:r>
+    </w:p>
+    <w:p>
       <w:r>
         <w:rPr>
           <w:highlight w:val="yellow"/>
@@ -3719,6 +3863,14 @@
       </w:r>
     </w:p>
     <w:p>
+      <w:pPr>
+        <w:pStyle w:val="Heading4"/>
+      </w:pPr>
+      <w:r>
+        <w:t>Verbrauchbare Energiespeicher</w:t>
+      </w:r>
+    </w:p>
+    <w:p>
       <w:r>
         <w:rPr>
           <w:highlight w:val="yellow"/>
@@ -3761,6 +3913,14 @@
       </w:r>
     </w:p>
     <w:p>
+      <w:r>
+        <w:rPr>
+          <w:highlight w:val="magenta"/>
+        </w:rPr>
+        <w:t>Die Leuchtstärke nimmt mit Nähe oder günstiger Verbindung zu; magische Wände oder abschirmendes Material können das Signal schwächen.</w:t>
+      </w:r>
+    </w:p>
+    <w:p>
       <w:pPr>
         <w:pStyle w:val="Heading2"/>
       </w:pPr>
@@ -3803,6 +3963,14 @@
       </w:r>
     </w:p>
     <w:p>
+      <w:r>
+        <w:rPr>
+          <w:highlight w:val="magenta"/>
+        </w:rPr>
+        <w:t>Solche Gegenstände umgehen nicht automatisch jede Schutzmassnahme, sondern funktionieren innerhalb bestimmter magischer Verbindungen.</w:t>
+      </w:r>
+    </w:p>
+    <w:p>
       <w:pPr>
         <w:pStyle w:val="Heading2"/>
       </w:pPr>
@@ -3850,6 +4018,14 @@
       </w:r>
     </w:p>
     <w:p>
+      <w:pPr>
+        <w:pStyle w:val="Heading4"/>
+      </w:pPr>
+      <w:r>
+        <w:t>Lebenstrank / Lebenselixier</w:t>
+      </w:r>
+    </w:p>
+    <w:p>
       <w:r>
         <w:rPr>
           <w:highlight w:val="yellow"/>
@@ -3900,6 +4076,14 @@
       </w:r>
     </w:p>
     <w:p>
+      <w:pPr>
+        <w:pStyle w:val="Heading4"/>
+      </w:pPr>
+      <w:r>
+        <w:t>Atheris Nocturnis und die Vernichtung des Rezepts</w:t>
+      </w:r>
+    </w:p>
+    <w:p>
       <w:r>
         <w:rPr>
           <w:highlight w:val="yellow"/>
@@ -3934,6 +4118,14 @@
       </w:r>
     </w:p>
     <w:p>
+      <w:r>
+        <w:rPr>
+          <w:highlight w:val="magenta"/>
+        </w:rPr>
+        <w:t>Die bekannten Bestandteile sind in SimsWelt grundsätzlich beschaffbar, auch wenn Transsilvanien als naheliegende Quelle für seltene Zutaten gilt.</w:t>
+      </w:r>
+    </w:p>
+    <w:p>
       <w:pPr>
         <w:pStyle w:val="Heading3"/>
       </w:pPr>
@@ -4010,6 +4202,14 @@
       </w:r>
     </w:p>
     <w:p>
+      <w:pPr>
+        <w:pStyle w:val="Heading4"/>
+      </w:pPr>
+      <w:r>
+        <w:t>Restbestände und Forschung am Anma-Sud</w:t>
+      </w:r>
+    </w:p>
+    <w:p>
       <w:r>
         <w:rPr>
           <w:highlight w:val="yellow"/>
@@ -4094,6 +4294,14 @@
       </w:r>
     </w:p>
     <w:p>
+      <w:pPr>
+        <w:pStyle w:val="Heading4"/>
+      </w:pPr>
+      <w:r>
+        <w:t>Alter und Unsterblichkeit</w:t>
+      </w:r>
+    </w:p>
+    <w:p>
       <w:r>
         <w:rPr>
           <w:highlight w:val="yellow"/>
@@ -4136,6 +4344,14 @@
       </w:r>
     </w:p>
     <w:p>
+      <w:pPr>
+        <w:pStyle w:val="Heading4"/>
+      </w:pPr>
+      <w:r>
+        <w:t>Individuelle Unterschiede</w:t>
+      </w:r>
+    </w:p>
+    <w:p>
       <w:r>
         <w:rPr>
           <w:highlight w:val="yellow"/>
@@ -4236,6 +4452,14 @@
       </w:r>
     </w:p>
     <w:p>
+      <w:pPr>
+        <w:pStyle w:val="Heading4"/>
+      </w:pPr>
+      <w:r>
+        <w:t>Sonnenresistenz</w:t>
+      </w:r>
+    </w:p>
+    <w:p>
       <w:r>
         <w:rPr>
           <w:highlight w:val="yellow"/>
@@ -4407,6 +4631,14 @@
       </w:r>
     </w:p>
     <w:p>
+      <w:pPr>
+        <w:pStyle w:val="Heading4"/>
+      </w:pPr>
+      <w:r>
+        <w:t>Vorurteile gegenüber Blutstatus</w:t>
+      </w:r>
+    </w:p>
+    <w:p>
       <w:r>
         <w:rPr>
           <w:highlight w:val="yellow"/>
@@ -4491,6 +4723,14 @@
       </w:r>
     </w:p>
     <w:p>
+      <w:pPr>
+        <w:pStyle w:val="Heading4"/>
+      </w:pPr>
+      <w:r>
+        <w:t>Teleportation</w:t>
+      </w:r>
+    </w:p>
+    <w:p>
       <w:r>
         <w:rPr>
           <w:highlight w:val="yellow"/>
@@ -4593,6 +4833,14 @@
       </w:r>
     </w:p>
     <w:p>
+      <w:r>
+        <w:rPr>
+          <w:highlight w:val="magenta"/>
+        </w:rPr>
+        <w:t>Manche Vampire nehmen nur Okkultaura wahr.</w:t>
+      </w:r>
+    </w:p>
+    <w:p>
       <w:pPr>
         <w:pStyle w:val="Heading3"/>
       </w:pPr>
@@ -4606,6 +4854,14 @@
       </w:r>
     </w:p>
     <w:p>
+      <w:pPr>
+        <w:pStyle w:val="Heading4"/>
+      </w:pPr>
+      <w:r>
+        <w:t>Weitere seltene oder individuelle Fähigkeiten</w:t>
+      </w:r>
+    </w:p>
+    <w:p>
       <w:r>
         <w:rPr>
           <w:highlight w:val="yellow"/>
@@ -4627,6 +4883,14 @@
       </w:r>
     </w:p>
     <w:p>
+      <w:r>
+        <w:rPr>
+          <w:highlight w:val="magenta"/>
+        </w:rPr>
+        <w:t>Ältere Lorelisten nennen auch spontane depressive oder traurige Schübe als mögliche Ausprägung, nicht als universelles Merkmal.</w:t>
+      </w:r>
+    </w:p>
+    <w:p>
       <w:pPr>
         <w:pStyle w:val="Heading2"/>
       </w:pPr>
@@ -4660,6 +4924,14 @@
       </w:r>
     </w:p>
     <w:p>
+      <w:pPr>
+        <w:pStyle w:val="Heading4"/>
+      </w:pPr>
+      <w:r>
+        <w:t>Ursprung und Übertragung</w:t>
+      </w:r>
+    </w:p>
+    <w:p>
       <w:r>
         <w:rPr>
           <w:highlight w:val="yellow"/>
@@ -4668,6 +4940,14 @@
       </w:r>
     </w:p>
     <w:p>
+      <w:pPr>
+        <w:pStyle w:val="Heading4"/>
+      </w:pPr>
+      <w:r>
+        <w:t>Verlauf</w:t>
+      </w:r>
+    </w:p>
+    <w:p>
       <w:r>
         <w:rPr>
           <w:highlight w:val="yellow"/>
@@ -4676,6 +4956,14 @@
       </w:r>
     </w:p>
     <w:p>
+      <w:pPr>
+        <w:pStyle w:val="Heading4"/>
+      </w:pPr>
+      <w:r>
+        <w:t>Sinenima</w:t>
+      </w:r>
+    </w:p>
+    <w:p>
       <w:r>
         <w:rPr>
           <w:highlight w:val="yellow"/>
@@ -4684,6 +4972,14 @@
       </w:r>
     </w:p>
     <w:p>
+      <w:pPr>
+        <w:pStyle w:val="Heading4"/>
+      </w:pPr>
+      <w:r>
+        <w:t>Wirkung von Licht</w:t>
+      </w:r>
+    </w:p>
+    <w:p>
       <w:r>
         <w:rPr>
           <w:highlight w:val="yellow"/>
@@ -4692,6 +4988,14 @@
       </w:r>
     </w:p>
     <w:p>
+      <w:pPr>
+        <w:pStyle w:val="Heading4"/>
+      </w:pPr>
+      <w:r>
+        <w:t>Bewusstsein</w:t>
+      </w:r>
+    </w:p>
+    <w:p>
       <w:r>
         <w:rPr>
           <w:highlight w:val="yellow"/>
@@ -4700,6 +5004,14 @@
       </w:r>
     </w:p>
     <w:p>
+      <w:pPr>
+        <w:pStyle w:val="Heading4"/>
+      </w:pPr>
+      <w:r>
+        <w:t>Behandlung und Forschung</w:t>
+      </w:r>
+    </w:p>
+    <w:p>
       <w:r>
         <w:rPr>
           <w:highlight w:val="yellow"/>
@@ -4708,6 +5020,14 @@
       </w:r>
     </w:p>
     <w:p>
+      <w:pPr>
+        <w:pStyle w:val="Heading4"/>
+      </w:pPr>
+      <w:r>
+        <w:t>Massnahmen bei einem Ausbruch</w:t>
+      </w:r>
+    </w:p>
+    <w:p>
       <w:r>
         <w:rPr>
           <w:highlight w:val="yellow"/>
@@ -4780,6 +5100,14 @@
       </w:r>
     </w:p>
     <w:p>
+      <w:pPr>
+        <w:pStyle w:val="Heading4"/>
+      </w:pPr>
+      <w:r>
+        <w:t>Lykanthropie</w:t>
+      </w:r>
+    </w:p>
+    <w:p>
       <w:r>
         <w:rPr>
           <w:highlight w:val="yellow"/>
@@ -4835,6 +5163,14 @@
       </w:r>
     </w:p>
     <w:p>
+      <w:r>
+        <w:rPr>
+          <w:highlight w:val="magenta"/>
+        </w:rPr>
+        <w:t>Die Verwandlung kann eine Übergangsphase besitzen; ein Betroffener kann bereits als 'dabei, ein Werwolf zu werden' gelten, bevor die neue Natur vollständig beherrscht wird.</w:t>
+      </w:r>
+    </w:p>
+    <w:p>
       <w:pPr>
         <w:pStyle w:val="Heading3"/>
       </w:pPr>
@@ -4869,6 +5205,14 @@
       </w:r>
     </w:p>
     <w:p>
+      <w:pPr>
+        <w:pStyle w:val="Heading4"/>
+      </w:pPr>
+      <w:r>
+        <w:t>Sim- und Wolfsgestalt</w:t>
+      </w:r>
+    </w:p>
+    <w:p>
       <w:r>
         <w:rPr>
           <w:highlight w:val="yellow"/>
@@ -4901,6 +5245,14 @@
       </w:r>
     </w:p>
     <w:p>
+      <w:pPr>
+        <w:pStyle w:val="Heading4"/>
+      </w:pPr>
+      <w:r>
+        <w:t>Verwandlung durch Willenskraft</w:t>
+      </w:r>
+    </w:p>
+    <w:p>
       <w:r>
         <w:rPr>
           <w:highlight w:val="yellow"/>
@@ -4909,6 +5261,14 @@
       </w:r>
     </w:p>
     <w:p>
+      <w:pPr>
+        <w:pStyle w:val="Heading4"/>
+      </w:pPr>
+      <w:r>
+        <w:t>Kontrolle über die Wolfsgestalt</w:t>
+      </w:r>
+    </w:p>
+    <w:p>
       <w:r>
         <w:rPr>
           <w:highlight w:val="yellow"/>
@@ -4930,6 +5290,14 @@
       </w:r>
     </w:p>
     <w:p>
+      <w:pPr>
+        <w:pStyle w:val="Heading4"/>
+      </w:pPr>
+      <w:r>
+        <w:t>Junge Werwölfe und Mondlicht</w:t>
+      </w:r>
+    </w:p>
+    <w:p>
       <w:r>
         <w:rPr>
           <w:highlight w:val="yellow"/>
@@ -4964,6 +5332,14 @@
       </w:r>
     </w:p>
     <w:p>
+      <w:pPr>
+        <w:pStyle w:val="Heading4"/>
+      </w:pPr>
+      <w:r>
+        <w:t>Folgen von Mondentzug</w:t>
+      </w:r>
+    </w:p>
+    <w:p>
       <w:r>
         <w:rPr>
           <w:highlight w:val="yellow"/>
@@ -4980,6 +5356,14 @@
       </w:r>
     </w:p>
     <w:p>
+      <w:pPr>
+        <w:pStyle w:val="Heading4"/>
+      </w:pPr>
+      <w:r>
+        <w:t>Selbstheilung</w:t>
+      </w:r>
+    </w:p>
+    <w:p>
       <w:r>
         <w:rPr>
           <w:highlight w:val="yellow"/>
@@ -4988,6 +5372,14 @@
       </w:r>
     </w:p>
     <w:p>
+      <w:pPr>
+        <w:pStyle w:val="Heading4"/>
+      </w:pPr>
+      <w:r>
+        <w:t>Aura- und Spurwahrnehmung</w:t>
+      </w:r>
+    </w:p>
+    <w:p>
       <w:r>
         <w:rPr>
           <w:highlight w:val="yellow"/>
@@ -5009,6 +5401,14 @@
       </w:r>
     </w:p>
     <w:p>
+      <w:pPr>
+        <w:pStyle w:val="Heading4"/>
+      </w:pPr>
+      <w:r>
+        <w:t>Stärke und Widerstandskraft</w:t>
+      </w:r>
+    </w:p>
+    <w:p>
       <w:r>
         <w:rPr>
           <w:highlight w:val="yellow"/>
@@ -5030,6 +5430,14 @@
       </w:r>
     </w:p>
     <w:p>
+      <w:pPr>
+        <w:pStyle w:val="Heading4"/>
+      </w:pPr>
+      <w:r>
+        <w:t>Geruchs- und Hörsinn</w:t>
+      </w:r>
+    </w:p>
+    <w:p>
       <w:r>
         <w:rPr>
           <w:highlight w:val="yellow"/>
@@ -5085,6 +5493,14 @@
       </w:r>
     </w:p>
     <w:p>
+      <w:pPr>
+        <w:pStyle w:val="Heading4"/>
+      </w:pPr>
+      <w:r>
+        <w:t>Kontrollverlust und Instinkte</w:t>
+      </w:r>
+    </w:p>
+    <w:p>
       <w:r>
         <w:rPr>
           <w:highlight w:val="yellow"/>
@@ -5111,6 +5527,14 @@
       </w:r>
     </w:p>
     <w:p>
+      <w:pPr>
+        <w:pStyle w:val="Heading4"/>
+      </w:pPr>
+      <w:r>
+        <w:t>Silber</w:t>
+      </w:r>
+    </w:p>
+    <w:p>
       <w:r>
         <w:rPr>
           <w:highlight w:val="yellow"/>
@@ -5187,6 +5611,14 @@
       </w:r>
     </w:p>
     <w:p>
+      <w:pPr>
+        <w:pStyle w:val="Heading4"/>
+      </w:pPr>
+      <w:r>
+        <w:t>Omega</w:t>
+      </w:r>
+    </w:p>
+    <w:p>
       <w:r>
         <w:rPr>
           <w:highlight w:val="yellow"/>
@@ -5195,6 +5627,14 @@
       </w:r>
     </w:p>
     <w:p>
+      <w:pPr>
+        <w:pStyle w:val="Heading4"/>
+      </w:pPr>
+      <w:r>
+        <w:t>Stärkende Alpha-Aura</w:t>
+      </w:r>
+    </w:p>
+    <w:p>
       <w:r>
         <w:rPr>
           <w:highlight w:val="yellow"/>
@@ -5203,6 +5643,14 @@
       </w:r>
     </w:p>
     <w:p>
+      <w:pPr>
+        <w:pStyle w:val="Heading4"/>
+      </w:pPr>
+      <w:r>
+        <w:t>Welpen und junge Werwölfe</w:t>
+      </w:r>
+    </w:p>
+    <w:p>
       <w:r>
         <w:rPr>
           <w:highlight w:val="yellow"/>
@@ -5284,6 +5732,14 @@
       </w:r>
     </w:p>
     <w:p>
+      <w:pPr>
+        <w:pStyle w:val="Heading4"/>
+      </w:pPr>
+      <w:r>
+        <w:t>Bedeutung des Rudels</w:t>
+      </w:r>
+    </w:p>
+    <w:p>
       <w:r>
         <w:rPr>
           <w:highlight w:val="yellow"/>
@@ -5292,6 +5748,14 @@
       </w:r>
     </w:p>
     <w:p>
+      <w:pPr>
+        <w:pStyle w:val="Heading4"/>
+      </w:pPr>
+      <w:r>
+        <w:t>Aufgaben und Pflichten</w:t>
+      </w:r>
+    </w:p>
+    <w:p>
       <w:r>
         <w:rPr>
           <w:highlight w:val="yellow"/>
@@ -5313,6 +5777,14 @@
       </w:r>
     </w:p>
     <w:p>
+      <w:pPr>
+        <w:pStyle w:val="Heading4"/>
+      </w:pPr>
+      <w:r>
+        <w:t>Bekannte Rollen im Rudel</w:t>
+      </w:r>
+    </w:p>
+    <w:p>
       <w:r>
         <w:rPr>
           <w:highlight w:val="yellow"/>
@@ -5384,6 +5856,14 @@
       </w:r>
     </w:p>
     <w:p>
+      <w:pPr>
+        <w:pStyle w:val="Heading4"/>
+      </w:pPr>
+      <w:r>
+        <w:t>Traditionelle Alpha-Paare und Gefährten</w:t>
+      </w:r>
+    </w:p>
+    <w:p>
       <w:r>
         <w:rPr>
           <w:highlight w:val="yellow"/>
@@ -5405,6 +5885,14 @@
       </w:r>
     </w:p>
     <w:p>
+      <w:pPr>
+        <w:pStyle w:val="Heading4"/>
+      </w:pPr>
+      <w:r>
+        <w:t>Gemeinschaftliche Verantwortung für Welpen</w:t>
+      </w:r>
+    </w:p>
+    <w:p>
       <w:r>
         <w:rPr>
           <w:highlight w:val="yellow"/>
@@ -5434,6 +5922,14 @@
       </w:r>
     </w:p>
     <w:p>
+      <w:pPr>
+        <w:pStyle w:val="Heading4"/>
+      </w:pPr>
+      <w:r>
+        <w:t>Gebissene und neue Werwölfe im Rudel</w:t>
+      </w:r>
+    </w:p>
+    <w:p>
       <w:r>
         <w:rPr>
           <w:highlight w:val="yellow"/>
@@ -5479,6 +5975,14 @@
       </w:r>
     </w:p>
     <w:p>
+      <w:pPr>
+        <w:pStyle w:val="Heading4"/>
+      </w:pPr>
+      <w:r>
+        <w:t>Lucian-Glaube und Führung</w:t>
+      </w:r>
+    </w:p>
+    <w:p>
       <w:r>
         <w:rPr>
           <w:highlight w:val="yellow"/>
@@ -5487,6 +5991,14 @@
       </w:r>
     </w:p>
     <w:p>
+      <w:r>
+        <w:rPr>
+          <w:highlight w:val="magenta"/>
+        </w:rPr>
+        <w:t>Alte Rudel überlieferten Geschichten und Lieder über ihn und lehrten diese den Jungen.</w:t>
+      </w:r>
+    </w:p>
+    <w:p>
       <w:pPr>
         <w:pStyle w:val="Heading2"/>
       </w:pPr>
@@ -5495,6 +6007,14 @@
       </w:r>
     </w:p>
     <w:p>
+      <w:pPr>
+        <w:pStyle w:val="Heading4"/>
+      </w:pPr>
+      <w:r>
+        <w:t>Moonwood Mill</w:t>
+      </w:r>
+    </w:p>
+    <w:p>
       <w:r>
         <w:rPr>
           <w:highlight w:val="yellow"/>
@@ -5503,6 +6023,14 @@
       </w:r>
     </w:p>
     <w:p>
+      <w:pPr>
+        <w:pStyle w:val="Heading4"/>
+      </w:pPr>
+      <w:r>
+        <w:t>Glimmerbrook und Strangerville</w:t>
+      </w:r>
+    </w:p>
+    <w:p>
       <w:r>
         <w:rPr>
           <w:highlight w:val="yellow"/>
@@ -5511,6 +6039,14 @@
       </w:r>
     </w:p>
     <w:p>
+      <w:pPr>
+        <w:pStyle w:val="Heading4"/>
+      </w:pPr>
+      <w:r>
+        <w:t>Lupus Noctis / Lupus Mana</w:t>
+      </w:r>
+    </w:p>
+    <w:p>
       <w:r>
         <w:rPr>
           <w:highlight w:val="yellow"/>
@@ -5519,6 +6055,14 @@
       </w:r>
     </w:p>
     <w:p>
+      <w:pPr>
+        <w:pStyle w:val="Heading4"/>
+      </w:pPr>
+      <w:r>
+        <w:t>Bedeutung des Blutmondes</w:t>
+      </w:r>
+    </w:p>
+    <w:p>
       <w:r>
         <w:rPr>
           <w:highlight w:val="yellow"/>
@@ -5527,6 +6071,14 @@
       </w:r>
     </w:p>
     <w:p>
+      <w:pPr>
+        <w:pStyle w:val="Heading4"/>
+      </w:pPr>
+      <w:r>
+        <w:t>Verlust des Zugangs</w:t>
+      </w:r>
+    </w:p>
+    <w:p>
       <w:r>
         <w:rPr>
           <w:highlight w:val="yellow"/>
@@ -5535,6 +6087,14 @@
       </w:r>
     </w:p>
     <w:p>
+      <w:pPr>
+        <w:pStyle w:val="Heading4"/>
+      </w:pPr>
+      <w:r>
+        <w:t>Erneuter Konflikt</w:t>
+      </w:r>
+    </w:p>
+    <w:p>
       <w:r>
         <w:rPr>
           <w:highlight w:val="yellow"/>
@@ -5577,6 +6137,14 @@
       </w:r>
     </w:p>
     <w:p>
+      <w:pPr>
+        <w:pStyle w:val="Heading4"/>
+      </w:pPr>
+      <w:r>
+        <w:t>Kampf um Bloodmoon Valley</w:t>
+      </w:r>
+    </w:p>
+    <w:p>
       <w:r>
         <w:rPr>
           <w:highlight w:val="yellow"/>
@@ -5585,6 +6153,14 @@
       </w:r>
     </w:p>
     <w:p>
+      <w:pPr>
+        <w:pStyle w:val="Heading4"/>
+      </w:pPr>
+      <w:r>
+        <w:t>Niederlage und Verbannung</w:t>
+      </w:r>
+    </w:p>
+    <w:p>
       <w:r>
         <w:rPr>
           <w:highlight w:val="yellow"/>
@@ -5606,6 +6182,22 @@
       </w:r>
     </w:p>
     <w:p>
+      <w:r>
+        <w:rPr>
+          <w:highlight w:val="magenta"/>
+        </w:rPr>
+        <w:t>Überleben erforderte ständige Bewegung, Späher, strenge Geräuschdisziplin und Schutz der Schwächsten.</w:t>
+      </w:r>
+    </w:p>
+    <w:p>
+      <w:r>
+        <w:rPr>
+          <w:highlight w:val="magenta"/>
+        </w:rPr>
+        <w:t>Heulen konnte aus Sicherheitsgründen auf Warnsignale hochrangiger Wölfe beschränkt werden.</w:t>
+      </w:r>
+    </w:p>
+    <w:p>
       <w:pPr>
         <w:pStyle w:val="Heading3"/>
       </w:pPr>
@@ -5656,6 +6248,14 @@
       </w:r>
     </w:p>
     <w:p>
+      <w:pPr>
+        <w:pStyle w:val="Heading4"/>
+      </w:pPr>
+      <w:r>
+        <w:t>Leben an Land und im Wasser</w:t>
+      </w:r>
+    </w:p>
+    <w:p>
       <w:r>
         <w:rPr>
           <w:highlight w:val="yellow"/>
@@ -5829,6 +6429,14 @@
       </w:r>
     </w:p>
     <w:p>
+      <w:pPr>
+        <w:pStyle w:val="Heading4"/>
+      </w:pPr>
+      <w:r>
+        <w:t>Übernatürliche Stärke</w:t>
+      </w:r>
+    </w:p>
+    <w:p>
       <w:r>
         <w:rPr>
           <w:highlight w:val="yellow"/>
@@ -5866,6 +6474,14 @@
       </w:r>
     </w:p>
     <w:p>
+      <w:pPr>
+        <w:pStyle w:val="Heading4"/>
+      </w:pPr>
+      <w:r>
+        <w:t>Aggressionen</w:t>
+      </w:r>
+    </w:p>
+    <w:p>
       <w:r>
         <w:rPr>
           <w:highlight w:val="yellow"/>
@@ -5950,6 +6566,14 @@
       </w:r>
     </w:p>
     <w:p>
+      <w:pPr>
+        <w:pStyle w:val="Heading4"/>
+      </w:pPr>
+      <w:r>
+        <w:t>Überlieferung über Leviathan</w:t>
+      </w:r>
+    </w:p>
+    <w:p>
       <w:r>
         <w:rPr>
           <w:highlight w:val="yellow"/>
@@ -5971,6 +6595,14 @@
       </w:r>
     </w:p>
     <w:p>
+      <w:pPr>
+        <w:pStyle w:val="Heading4"/>
+      </w:pPr>
+      <w:r>
+        <w:t>Das ehemalige Portal in Sulani</w:t>
+      </w:r>
+    </w:p>
+    <w:p>
       <w:r>
         <w:rPr>
           <w:highlight w:val="yellow"/>
@@ -5979,6 +6611,14 @@
       </w:r>
     </w:p>
     <w:p>
+      <w:pPr>
+        <w:pStyle w:val="Heading4"/>
+      </w:pPr>
+      <w:r>
+        <w:t>Zerstörung des Portals</w:t>
+      </w:r>
+    </w:p>
+    <w:p>
       <w:r>
         <w:rPr>
           <w:highlight w:val="yellow"/>
@@ -6494,6 +7134,14 @@
       </w:r>
     </w:p>
     <w:p>
+      <w:pPr>
+        <w:pStyle w:val="Heading4"/>
+      </w:pPr>
+      <w:r>
+        <w:t>Ältere Goblin-Lore</w:t>
+      </w:r>
+    </w:p>
+    <w:p>
       <w:r>
         <w:rPr>
           <w:highlight w:val="yellow"/>
@@ -6742,6 +7390,14 @@
       </w:r>
     </w:p>
     <w:p>
+      <w:pPr>
+        <w:pStyle w:val="Heading4"/>
+      </w:pPr>
+      <w:r>
+        <w:t>Abgrenzung der beiden Arten</w:t>
+      </w:r>
+    </w:p>
+    <w:p>
       <w:r>
         <w:rPr>
           <w:highlight w:val="yellow"/>
@@ -6865,6 +7521,22 @@
           <w:highlight w:val="yellow"/>
         </w:rPr>
         <w:t>Werwölfe sind Fremde in der Unterwelt. Mondmangel, Hunger und langjährige Schwächung machen einheimische Kreaturen für sie besonders gefährlich. Es gibt keinen belegten uralten Artkrieg zwischen den Unterweltwesen und Werwölfen.</w:t>
+      </w:r>
+    </w:p>
+    <w:p>
+      <w:r>
+        <w:rPr>
+          <w:highlight w:val="magenta"/>
+        </w:rPr>
+        <w:t>Im Gegensatz zu den dort verbannten Werwölfen werden die heimischen Wesen durch die Mondlosigkeit nicht grundsätzlich geschwächt.</w:t>
+      </w:r>
+    </w:p>
+    <w:p>
+      <w:r>
+        <w:rPr>
+          <w:highlight w:val="magenta"/>
+        </w:rPr>
+        <w:t>Die heimischen Unterweltwesen jagen geschwächte Werwölfe, die mangels Mondenergie häufig in Simsgestalt festsitzen.</w:t>
       </w:r>
     </w:p>
     <w:p>
@@ -7903,6 +8575,14 @@
       </w:r>
     </w:p>
     <w:p>
+      <w:r>
+        <w:rPr>
+          <w:highlight w:val="magenta"/>
+        </w:rPr>
+        <w:t>Verfluchte oder heimgesuchte Orte können körperlich wirkende Phänomene zeigen: erscheinende Gestalten, sich bewegende Gegenstände und sogar skelettartige oder körperteilähnliche Manifestationen.</w:t>
+      </w:r>
+    </w:p>
+    <w:p>
       <w:pPr>
         <w:pStyle w:val="Heading2"/>
       </w:pPr>
@@ -8331,6 +9011,14 @@
       </w:r>
     </w:p>
     <w:p>
+      <w:pPr>
+        <w:pStyle w:val="Heading4"/>
+      </w:pPr>
+      <w:r>
+        <w:t>Misstrauen, Verschwörungen und Verfolgung</w:t>
+      </w:r>
+    </w:p>
+    <w:p>
       <w:r>
         <w:rPr>
           <w:highlight w:val="yellow"/>
@@ -8402,6 +9090,14 @@
       </w:r>
     </w:p>
     <w:p>
+      <w:r>
+        <w:rPr>
+          <w:highlight w:val="magenta"/>
+        </w:rPr>
+        <w:t>Morpidians unterstützten technische und ökologische Entwicklungen.</w:t>
+      </w:r>
+    </w:p>
+    <w:p>
       <w:pPr>
         <w:pStyle w:val="Heading3"/>
       </w:pPr>
@@ -8423,6 +9119,14 @@
       </w:r>
     </w:p>
     <w:p>
+      <w:r>
+        <w:rPr>
+          <w:highlight w:val="magenta"/>
+        </w:rPr>
+        <w:t>Weitere Szenen nennen Morpidia als Herkunftsplanet und zeigen organisierte Strukturen mit einem Rat sowie die Verarbeitung gesammelter Ressourcen.</w:t>
+      </w:r>
+    </w:p>
+    <w:p>
       <w:pPr>
         <w:pStyle w:val="Heading3"/>
       </w:pPr>
@@ -8822,6 +9526,14 @@
       </w:r>
     </w:p>
     <w:p>
+      <w:pPr>
+        <w:pStyle w:val="Heading4"/>
+      </w:pPr>
+      <w:r>
+        <w:t>Weitere vampirische und andere Hybriden</w:t>
+      </w:r>
+    </w:p>
+    <w:p>
       <w:r>
         <w:rPr>
           <w:highlight w:val="yellow"/>
@@ -8844,6 +9556,14 @@
     </w:p>
     <w:p>
       <w:pPr>
+        <w:pStyle w:val="Heading4"/>
+      </w:pPr>
+      <w:r>
+        <w:t>Regeln für Fähigkeiten und Schwächen von Hybriden</w:t>
+      </w:r>
+    </w:p>
+    <w:p>
+      <w:pPr>
         <w:pStyle w:val="ListBullet"/>
       </w:pPr>
       <w:r>
@@ -9176,6 +9896,14 @@
       </w:r>
     </w:p>
     <w:p>
+      <w:r>
+        <w:rPr>
+          <w:highlight w:val="magenta"/>
+        </w:rPr>
+        <w:t>Solche Katastrophen können Portale destabilisieren, Welten überlappen lassen, Wesen in falsche Regionen schleudern und alternative Zeitlinien hervorbringen beziehungsweise zugänglich machen.</w:t>
+      </w:r>
+    </w:p>
+    <w:p>
       <w:pPr>
         <w:pStyle w:val="Heading2"/>
       </w:pPr>
@@ -9368,6 +10096,14 @@
       </w:r>
     </w:p>
     <w:p>
+      <w:r>
+        <w:rPr>
+          <w:highlight w:val="magenta"/>
+        </w:rPr>
+        <w:t>Feen gehören ebenfalls zum weiteren okkulten Bestand der SimsWelt, ihre konkrete RPG-Lore ist bislang kaum ausgearbeitet.</w:t>
+      </w:r>
+    </w:p>
+    <w:p>
       <w:pPr>
         <w:pStyle w:val="Heading2"/>
       </w:pPr>
@@ -9665,6 +10401,14 @@
       </w:r>
     </w:p>
     <w:p>
+      <w:r>
+        <w:rPr>
+          <w:highlight w:val="magenta"/>
+        </w:rPr>
+        <w:t>Als Überlieferung beziehungsweise Glaube zu kennzeichnen sind insbesondere die objektive Göttlichkeit von Alucard und Lucian, der angebliche Krieg mehrerer Götter gegen Lucian, Teile der Einhornlegenden, die genaue Geschichte Leviathans und manche sehr alten Bestiarienurteile über Arten.</w:t>
+      </w:r>
+    </w:p>
+    <w:p>
       <w:pPr>
         <w:pStyle w:val="Heading2"/>
       </w:pPr>
@@ -9844,6 +10588,27 @@
           <w:highlight w:val="yellow"/>
         </w:rPr>
         <w:t>Wie sieht Earth 616 in der Hauptzeitlinie tatsächlich aus?</w:t>
+      </w:r>
+    </w:p>
+    <w:p>
+      <w:r>
+        <w:rPr>
+          <w:b/>
+          <w:highlight w:val="magenta"/>
+        </w:rPr>
+        <w:t>Offen:</w:t>
+      </w:r>
+      <w:r>
+        <w:rPr>
+          <w:highlight w:val="magenta"/>
+        </w:rPr>
+        <w:t xml:space="preserve"> </w:t>
+      </w:r>
+      <w:r>
+        <w:rPr>
+          <w:highlight w:val="magenta"/>
+        </w:rPr>
+        <w:t>Nicht vollständig geklärt sind die genaue Natur von Utopia, Earth 616, Zauberallee, die exakte Grenze zwischen Zauberwald und Zentaurenwelt, mögliche weitere Portale sowie die vollständigen Naturgesetze der Kreuzung.</w:t>
       </w:r>
     </w:p>
     <w:p>

</xml_diff>

<commit_message>
lore: spell Trogule correctly and drop the invented note about older spellings
</commit_message>
<xml_diff>
--- a/src/atlas/data/lore/Okkult-Lore.docx
+++ b/src/atlas/data/lore/Okkult-Lore.docx
@@ -9278,17 +9278,17 @@
         <w:pStyle w:val="Heading2"/>
       </w:pPr>
       <w:r>
-        <w:t>16.4 Trugule</w:t>
-      </w:r>
-    </w:p>
-    <w:p>
-      <w:r>
-        <w:t>Die aktuell verwendete Schreibweise lautet Trugule. Ältere Quellen verwenden Trogul oder Trogule. Trugule entstehen aus Vampir- und Goblinabstammung. Sie werden in der zusammengetragenen Lore häufig als sehr gross und körperlich stark beschrieben. Bekannte mögliche Eigenschaften sind übernatürliche Kraft, sehr gutes Gehör und guter Geruchssinn. Hunger und vampirischer Blutdurst können gleichzeitig eine starke Rolle spielen. Als mögliche Schwächen werden schlechte Kontrolle über Blutdurst, fehlende Sonnenresistenz und fehlende Unsterblichkeit genannt.</w:t>
-      </w:r>
-    </w:p>
-    <w:p>
-      <w:r>
-        <w:t>Viele ältere Aussagen stammen aus einer Sammellore und müssen als Artmöglichkeit statt als starre Regel gelesen werden. Die frühere Bezeichnung „Trogul" wird nicht als zweite eigene Art behandelt, solange keine neue Lore dies ausdrücklich trennt. Trugule können sich mit Vampiren fortpflanzen; daraus kann die später als Trogier bezeichnete weitere Hybridstufe entstehen.</w:t>
+        <w:t>16.4 Trogule</w:t>
+      </w:r>
+    </w:p>
+    <w:p>
+      <w:r>
+        <w:t>Trogule entstehen aus Vampir- und Goblinabstammung. Sie werden in der zusammengetragenen Lore häufig als sehr gross und körperlich stark beschrieben. Bekannte mögliche Eigenschaften sind übernatürliche Kraft, sehr gutes Gehör und guter Geruchssinn. Hunger und vampirischer Blutdurst können gleichzeitig eine starke Rolle spielen. Als mögliche Schwächen werden schlechte Kontrolle über Blutdurst, fehlende Sonnenresistenz und fehlende Unsterblichkeit genannt.</w:t>
+      </w:r>
+    </w:p>
+    <w:p>
+      <w:r>
+        <w:t>Viele ältere Aussagen stammen aus einer Sammellore und müssen als Artmöglichkeit statt als starre Regel gelesen werden. Trogule können sich mit Vampiren fortpflanzen; daraus kann die später als Trogier bezeichnete weitere Hybridstufe entstehen.</w:t>
       </w:r>
     </w:p>
     <w:p>
@@ -9309,7 +9309,7 @@
         <w:rPr>
           <w:highlight w:val="yellow"/>
         </w:rPr>
-        <w:t>Diese Eigenschaften stammen aus der alten Artenbeschreibung und werden als bekannte Tendenzen behandelt, nicht als unvermeidliche Liste jedes Trugulen.</w:t>
+        <w:t>Diese Eigenschaften stammen aus der alten Artenbeschreibung und werden als bekannte Tendenzen behandelt, nicht als unvermeidliche Liste jedes Trogulen.</w:t>
       </w:r>
     </w:p>
     <w:p>
@@ -9322,7 +9322,7 @@
     </w:p>
     <w:p>
       <w:r>
-        <w:t>Trogier werden in der alten Lore als weitere Kreuzung aus einem Trugule beziehungsweise Trogul und einem Vampir beschrieben. Dadurch ist der vampirische Anteil erneut verstärkt. Alte Angaben nennen besonders gutes Gehör, starken Geruchssinn, aussergewöhnliche Stärke, Wundregeneration und Fledermausgestalt.</w:t>
+        <w:t>Trogier werden in der alten Lore als weitere Kreuzung aus einem Trogule und einem Vampir beschrieben. Dadurch ist der vampirische Anteil erneut verstärkt. Alte Angaben nennen besonders gutes Gehör, starken Geruchssinn, aussergewöhnliche Stärke, Wundregeneration und Fledermausgestalt.</w:t>
       </w:r>
     </w:p>
     <w:p>
@@ -9335,7 +9335,7 @@
         <w:rPr>
           <w:highlight w:val="yellow"/>
         </w:rPr>
-        <w:t>Der Begriff Trogier stammt aus älterer Mischwesen-Lore und bezeichnet einen Nachkommen aus Trugule-Abstammung und Vampir.</w:t>
+        <w:t>Der Begriff Trogier stammt aus älterer Mischwesen-Lore und bezeichnet einen Nachkommen aus Trogule-Abstammung und Vampir.</w:t>
       </w:r>
     </w:p>
     <w:p>
@@ -10170,7 +10170,7 @@
     </w:p>
     <w:p>
       <w:r>
-        <w:t>Bekannte Hybriden sind Dhampire, Trugule, Trogier, Lumicula und ein unbenannter Alien-Vampir-Hybrid. „Ungeblüter" ist ein gesellschaftlicher vampirischer Sammelbegriff für bestimmte okkulte Mischabstammungen.</w:t>
+        <w:t>Bekannte Hybriden sind Dhampire, Trogule, Trogier, Lumicula und ein unbenannter Alien-Vampir-Hybrid. „Ungeblüter" ist ein gesellschaftlicher vampirischer Sammelbegriff für bestimmte okkulte Mischabstammungen.</w:t>
       </w:r>
     </w:p>
     <w:p>
@@ -10215,12 +10215,12 @@
         <w:pStyle w:val="Heading3"/>
       </w:pPr>
       <w:r>
-        <w:t>18.5.2 Trugule und ältere Schreibweisen</w:t>
-      </w:r>
-    </w:p>
-    <w:p>
-      <w:r>
-        <w:t>Trugule ist die bevorzugte aktuelle Schreibweise. Trogul und Trogule sind ältere Varianten. Trogier bleibt eine separate alte Hybridbezeichnung für eine weitere Kreuzung mit Vampiranteil.</w:t>
+        <w:t>18.5.2 Trogule und Trogier</w:t>
+      </w:r>
+    </w:p>
+    <w:p>
+      <w:r>
+        <w:t>Trogier ist eine separate alte Hybridbezeichnung für eine weitere Kreuzung mit Vampiranteil.</w:t>
       </w:r>
     </w:p>
     <w:p>

</xml_diff>

<commit_message>
lore: add details on the underworld and the banished pack from the forum
</commit_message>
<xml_diff>
--- a/src/atlas/data/lore/Okkult-Lore.docx
+++ b/src/atlas/data/lore/Okkult-Lore.docx
@@ -65,6 +65,17 @@
       </w:r>
     </w:p>
     <w:p>
+      <w:pPr>
+        <w:pStyle w:val="ListBullet"/>
+      </w:pPr>
+      <w:r>
+        <w:rPr>
+          <w:highlight w:val="lightGray"/>
+        </w:rPr>
+        <w:t>Grau: aus dem Forum, Thread «Die Unterwelt» (https://www.simsforumrpg.de/t425f51855-Die-Unterwelt.html)</w:t>
+      </w:r>
+    </w:p>
+    <w:p>
       <w:r>
         <w:t>Die Markierungen dienen nur der Prüfung. Wo eine Ergänzung doppelt ist, kann sie gestrichen werden. Sind alle geprüft, kann die Markierung entfernt werden – ATLAS liest den Text mit oder ohne Farbe gleich.</w:t>
       </w:r>
@@ -1437,6 +1448,30 @@
       </w:r>
     </w:p>
     <w:p>
+      <w:r>
+        <w:rPr>
+          <w:highlight w:val="lightGray"/>
+        </w:rPr>
+        <w:t>In der Unterwelt herrscht ewige Dämmerung: ein bleiches, diffuses Licht, das kaum Schatten wirft.</w:t>
+      </w:r>
+    </w:p>
+    <w:p>
+      <w:r>
+        <w:rPr>
+          <w:highlight w:val="lightGray"/>
+        </w:rPr>
+        <w:t>Trotzdem gibt es Tag und Nacht. Tagsüber scheint die Sonne nie in vollem Glanz; die Nächte sind fast undurchdringlich dunkel und nur von blassen Sternen und dem spärlichen diffusen Licht erhellt.</w:t>
+      </w:r>
+    </w:p>
+    <w:p>
+      <w:r>
+        <w:rPr>
+          <w:highlight w:val="lightGray"/>
+        </w:rPr>
+        <w:t>Die Landschaft besteht aus düsteren, nebligen Wäldern mit uralten, verkrüppelten Bäumen und schwarzem Laub, karger Vegetation sowie verlassenen Ruinen und verfallenen Gebäuden.</w:t>
+      </w:r>
+    </w:p>
+    <w:p>
       <w:pPr>
         <w:pStyle w:val="Heading3"/>
       </w:pPr>
@@ -1497,6 +1532,14 @@
           <w:highlight w:val="yellow"/>
         </w:rPr>
         <w:t>Der Rat beschloss, diese Verbindung zu kappen.</w:t>
+      </w:r>
+    </w:p>
+    <w:p>
+      <w:r>
+        <w:rPr>
+          <w:highlight w:val="lightGray"/>
+        </w:rPr>
+        <w:t>Laut der Weltbeschreibung gibt es keinen Zugang und keinen Ausgang.</w:t>
       </w:r>
     </w:p>
     <w:p>
@@ -2970,6 +3013,14 @@
       </w:r>
     </w:p>
     <w:p>
+      <w:r>
+        <w:rPr>
+          <w:highlight w:val="lightGray"/>
+        </w:rPr>
+        <w:t>Zum Anwenden von Magie gehören Zauberformeln, magische Bräuche und eine eigene okkulte Sprache.</w:t>
+      </w:r>
+    </w:p>
+    <w:p>
       <w:pPr>
         <w:pStyle w:val="Heading3"/>
       </w:pPr>
@@ -6169,6 +6220,22 @@
       </w:r>
     </w:p>
     <w:p>
+      <w:r>
+        <w:rPr>
+          <w:highlight w:val="lightGray"/>
+        </w:rPr>
+        <w:t>Der frühere Alpha von Lupus Noctis führte den Krieg rund 200 Jahre lang, bevor er fiel; seine Gefährtin war zu diesem Zeitpunkt längst tot.</w:t>
+      </w:r>
+    </w:p>
+    <w:p>
+      <w:r>
+        <w:rPr>
+          <w:highlight w:val="lightGray"/>
+        </w:rPr>
+        <w:t>Der nicht verbannte Teil des Rudels verbarg die Welpen in Verstecken in Moonwood Mill und musste sich dort auch vor den Sims in Acht nehmen, die wieder in den Ort gezogen waren.</w:t>
+      </w:r>
+    </w:p>
+    <w:p>
       <w:pPr>
         <w:pStyle w:val="Heading3"/>
       </w:pPr>
@@ -6198,6 +6265,22 @@
       </w:r>
     </w:p>
     <w:p>
+      <w:r>
+        <w:rPr>
+          <w:highlight w:val="lightGray"/>
+        </w:rPr>
+        <w:t>In der Verbannung zog Ragnars Rudel in fester Ordnung weiter: die Alten und Schwächsten voran, dann die Erwachsenen, die Welpen, die verbliebenen Betas und zuletzt der Alpha, der alles überwachte.</w:t>
+      </w:r>
+    </w:p>
+    <w:p>
+      <w:r>
+        <w:rPr>
+          <w:highlight w:val="lightGray"/>
+        </w:rPr>
+        <w:t>Ragnar verbot seinem Rudel das Heulen; nur Betawölfe durften noch heulen, und nur wenn Gefahr drohte.</w:t>
+      </w:r>
+    </w:p>
+    <w:p>
       <w:pPr>
         <w:pStyle w:val="Heading3"/>
       </w:pPr>
@@ -7424,6 +7507,14 @@
     <w:p>
       <w:r>
         <w:t>Die Unterwelt besitzt eine eigene Kreaturenwelt. Bestätigt sind Dämonen, Harpyien, Schattenkreaturen und weitere nicht näher bestimmte wilde Wesen. Diese Arten sind an ewige Dunkelheit und mondlose Bedingungen angepasst.</w:t>
+      </w:r>
+    </w:p>
+    <w:p>
+      <w:r>
+        <w:rPr>
+          <w:highlight w:val="lightGray"/>
+        </w:rPr>
+        <w:t>Manche der heimischen Kreaturen haben simlische Züge, andere sind völlig anders. Sie sind wild und jagen Eindringlinge als Beute.</w:t>
       </w:r>
     </w:p>
     <w:p>

</xml_diff>

<commit_message>
lore: add details from the uploaded forum posts
</commit_message>
<xml_diff>
--- a/src/atlas/data/lore/Okkult-Lore.docx
+++ b/src/atlas/data/lore/Okkult-Lore.docx
@@ -72,7 +72,7 @@
         <w:rPr>
           <w:highlight w:val="lightGray"/>
         </w:rPr>
-        <w:t>Grau: aus dem Forum, Thread «Die Unterwelt» (https://www.simsforumrpg.de/t425f51855-Die-Unterwelt.html)</w:t>
+        <w:t>Grau: aus dem Forum – Thread «Die Unterwelt» (https://www.simsforumrpg.de/t425f51855-Die-Unterwelt.html) und die am 22.09.2026 hochgeladenen Forumsbeiträge</w:t>
       </w:r>
     </w:p>
     <w:p>
@@ -326,6 +326,27 @@
           <w:highlight w:val="yellow"/>
         </w:rPr>
         <w:t>Direkt ausgespielte und klar beobachtete Lore hat Vorrang vor älteren allgemeinen Beschreibungen, wenn beides miteinander kollidiert.</w:t>
+      </w:r>
+    </w:p>
+    <w:p>
+      <w:r>
+        <w:rPr>
+          <w:b/>
+          <w:highlight w:val="lightGray"/>
+        </w:rPr>
+        <w:t>Regel:</w:t>
+      </w:r>
+      <w:r>
+        <w:rPr>
+          <w:highlight w:val="lightGray"/>
+        </w:rPr>
+        <w:t xml:space="preserve"> </w:t>
+      </w:r>
+      <w:r>
+        <w:rPr>
+          <w:highlight w:val="lightGray"/>
+        </w:rPr>
+        <w:t>Bei der Charaktererstellung sind nur okkulte Arten zugelassen, die im Spiel vorkommen. Diese dürfen frei ausgeschmückt werden.</w:t>
       </w:r>
     </w:p>
     <w:p>
@@ -1543,6 +1564,22 @@
       </w:r>
     </w:p>
     <w:p>
+      <w:r>
+        <w:rPr>
+          <w:highlight w:val="lightGray"/>
+        </w:rPr>
+        <w:t>Laut Draculia war das Portal von Bloodmoon Valley einst mit dem der Unterwelt verbunden.</w:t>
+      </w:r>
+    </w:p>
+    <w:p>
+      <w:r>
+        <w:rPr>
+          <w:highlight w:val="lightGray"/>
+        </w:rPr>
+        <w:t>Auf der Suche nach der Unterwelt wurde ein weiteres Portal entdeckt; es führte in eine Welt, die der Unterwelt ähnlich, aber nicht dieselbe war.</w:t>
+      </w:r>
+    </w:p>
+    <w:p>
       <w:pPr>
         <w:pStyle w:val="Heading2"/>
       </w:pPr>
@@ -1611,6 +1648,14 @@
           <w:highlight w:val="yellow"/>
         </w:rPr>
         <w:t>Ein Silbermond verleiht ihm eine besondere Atmosphäre.</w:t>
+      </w:r>
+    </w:p>
+    <w:p>
+      <w:r>
+        <w:rPr>
+          <w:highlight w:val="lightGray"/>
+        </w:rPr>
+        <w:t>Vampire meiden den Zauberwald. Der Gelehrte Ocellus, der den Wald und seinen Silbermond beschrieb, konnte sich den Grund dafür nicht erklären.</w:t>
       </w:r>
     </w:p>
     <w:p>
@@ -3084,6 +3129,14 @@
       </w:r>
     </w:p>
     <w:p>
+      <w:r>
+        <w:rPr>
+          <w:highlight w:val="lightGray"/>
+        </w:rPr>
+        <w:t>Ältere Listen nennen als mögliche Folgen des Zauberns körperliche Schäden, Vergesslichkeit und im schlimmsten Fall den Verlust des Verstandes.</w:t>
+      </w:r>
+    </w:p>
+    <w:p>
       <w:pPr>
         <w:pStyle w:val="Heading2"/>
       </w:pPr>
@@ -4824,6 +4877,14 @@
       </w:r>
     </w:p>
     <w:p>
+      <w:r>
+        <w:rPr>
+          <w:highlight w:val="lightGray"/>
+        </w:rPr>
+        <w:t>Ältere Listen nennen als mögliche Schwäche, dass ein Vampir in Fledermausgestalt nicht sprechen kann.</w:t>
+      </w:r>
+    </w:p>
+    <w:p>
       <w:pPr>
         <w:pStyle w:val="Heading3"/>
       </w:pPr>
@@ -5188,6 +5249,27 @@
       </w:r>
     </w:p>
     <w:p>
+      <w:r>
+        <w:rPr>
+          <w:b/>
+          <w:highlight w:val="lightGray"/>
+        </w:rPr>
+        <w:t>Überlieferung:</w:t>
+      </w:r>
+      <w:r>
+        <w:rPr>
+          <w:highlight w:val="lightGray"/>
+        </w:rPr>
+        <w:t xml:space="preserve"> </w:t>
+      </w:r>
+      <w:r>
+        <w:rPr>
+          <w:highlight w:val="lightGray"/>
+        </w:rPr>
+        <w:t>Ein vampirisches Buch über Fabelwesen, aus dem Deathdealer Adam zitiert, beschreibt Werwölfe als tollwütig und angriffslustig; wer einem Werwolf begegnet sei, sei nie zurückgekehrt.</w:t>
+      </w:r>
+    </w:p>
+    <w:p>
       <w:pPr>
         <w:pStyle w:val="Heading3"/>
       </w:pPr>
@@ -5201,6 +5283,14 @@
       </w:r>
     </w:p>
     <w:p>
+      <w:r>
+        <w:rPr>
+          <w:highlight w:val="lightGray"/>
+        </w:rPr>
+        <w:t>Werwölfe nennen sich selbst gerne Lykaner.</w:t>
+      </w:r>
+    </w:p>
+    <w:p>
       <w:pPr>
         <w:pStyle w:val="Heading3"/>
       </w:pPr>
@@ -5370,6 +5460,14 @@
       </w:r>
     </w:p>
     <w:p>
+      <w:r>
+        <w:rPr>
+          <w:highlight w:val="lightGray"/>
+        </w:rPr>
+        <w:t>Auf der Suche nach Ragnar zog Hepzibah verschiedene Magier zurate. Der mächtigste ihrer Zauber bewirkte, dass Werwölfe seither ohne den Einfluss des Mondes über ihre Gestalt entscheiden können. Ob diese Kraft auch andere Welten erreichte, ist fraglich.</w:t>
+      </w:r>
+    </w:p>
+    <w:p>
       <w:pPr>
         <w:pStyle w:val="Heading3"/>
       </w:pPr>
@@ -5497,6 +5595,14 @@
       </w:r>
     </w:p>
     <w:p>
+      <w:r>
+        <w:rPr>
+          <w:highlight w:val="lightGray"/>
+        </w:rPr>
+        <w:t>Wölfe können Geruchsspuren folgen, die schon einige Tage alt sind.</w:t>
+      </w:r>
+    </w:p>
+    <w:p>
       <w:pPr>
         <w:pStyle w:val="Heading3"/>
       </w:pPr>
@@ -5628,6 +5734,14 @@
       </w:r>
     </w:p>
     <w:p>
+      <w:r>
+        <w:rPr>
+          <w:highlight w:val="lightGray"/>
+        </w:rPr>
+        <w:t>Eine einzelgängerische Werwölfin durchläuft jedes Jahr einen Zyklus mit verlockendem Duft, obwohl ihr Körper keinen Nachwuchs mehr hervorbringen kann; ohne Rudel erschwert ihr das das Leben stark.</w:t>
+      </w:r>
+    </w:p>
+    <w:p>
       <w:pPr>
         <w:pStyle w:val="Heading3"/>
       </w:pPr>
@@ -5710,6 +5824,14 @@
       </w:r>
     </w:p>
     <w:p>
+      <w:r>
+        <w:rPr>
+          <w:highlight w:val="lightGray"/>
+        </w:rPr>
+        <w:t>In einer Geschichte heisst es, es gebe immer weniger Gestaltwandler; ein Rudel sei deshalb etwas Kostbares.</w:t>
+      </w:r>
+    </w:p>
+    <w:p>
       <w:pPr>
         <w:pStyle w:val="Heading3"/>
       </w:pPr>
@@ -6294,6 +6416,14 @@
       </w:r>
     </w:p>
     <w:p>
+      <w:r>
+        <w:rPr>
+          <w:highlight w:val="lightGray"/>
+        </w:rPr>
+        <w:t>Nach der Rückkehr zählte Lupus Noctis knapp dreissig Wölfe.</w:t>
+      </w:r>
+    </w:p>
+    <w:p>
       <w:pPr>
         <w:pStyle w:val="Heading1"/>
       </w:pPr>
@@ -6990,6 +7120,27 @@
       </w:r>
     </w:p>
     <w:p>
+      <w:r>
+        <w:rPr>
+          <w:b/>
+          <w:highlight w:val="lightGray"/>
+        </w:rPr>
+        <w:t>Überlieferung:</w:t>
+      </w:r>
+      <w:r>
+        <w:rPr>
+          <w:highlight w:val="lightGray"/>
+        </w:rPr>
+        <w:t xml:space="preserve"> </w:t>
+      </w:r>
+      <w:r>
+        <w:rPr>
+          <w:highlight w:val="lightGray"/>
+        </w:rPr>
+        <w:t>Der Zentaur Cheiron erzählt von einem „Goldenen Zeitalter", in dem die Zentauren im Einklang mit der Natur lebten. Danach kamen Kriege, Missgunst, Hass und die Verfolgung durch die Sims, und die Wesen des Waldes zogen sich in ihre letzten Refugien zurück.</w:t>
+      </w:r>
+    </w:p>
+    <w:p>
       <w:pPr>
         <w:pStyle w:val="Heading3"/>
       </w:pPr>
@@ -7037,6 +7188,14 @@
       </w:r>
     </w:p>
     <w:p>
+      <w:r>
+        <w:rPr>
+          <w:highlight w:val="lightGray"/>
+        </w:rPr>
+        <w:t>Ältere Listen nennen ausserdem Verwundbarkeit wegen ihrer Grösse und eingeschränkte Beweglichkeit.</w:t>
+      </w:r>
+    </w:p>
+    <w:p>
       <w:pPr>
         <w:pStyle w:val="Heading3"/>
       </w:pPr>
@@ -7167,6 +7326,27 @@
           <w:highlight w:val="yellow"/>
         </w:rPr>
         <w:t>Ein Einhorn wurde dauerhaft in eine Simfrau verwandelt, verlor dadurch Unsterblichkeit und bekam später ein Kind, das einen Teil der Einhornmagie erbte. Daraus werden keine allgemeinen Fortpflanzungsregeln abgeleitet.</w:t>
+      </w:r>
+    </w:p>
+    <w:p>
+      <w:r>
+        <w:rPr>
+          <w:b/>
+          <w:highlight w:val="lightGray"/>
+        </w:rPr>
+        <w:t>Überlieferung:</w:t>
+      </w:r>
+      <w:r>
+        <w:rPr>
+          <w:highlight w:val="lightGray"/>
+        </w:rPr>
+        <w:t xml:space="preserve"> </w:t>
+      </w:r>
+      <w:r>
+        <w:rPr>
+          <w:highlight w:val="lightGray"/>
+        </w:rPr>
+        <w:t>Einem alten Märchen nach, das Marishka erzählt, hiess das letzte Einhorn Amalthea. Es verliebte sich in einen Prinzen und liess sich von einem Zauberer in eine Simin verwandeln. Gemeinsam regierten die beiden ein Königreich jenseits der Nordwinde. Mit der Verwandlung endete Amaltheas Unsterblichkeit; sie starb kinderlos an der Seite des Königs.</w:t>
       </w:r>
     </w:p>
     <w:p>

</xml_diff>

<commit_message>
lore: link names to the topic explaining them, explain Morpidianer and correct Lupus Mana
</commit_message>
<xml_diff>
--- a/src/atlas/data/lore/Okkult-Lore.docx
+++ b/src/atlas/data/lore/Okkult-Lore.docx
@@ -76,6 +76,17 @@
       </w:r>
     </w:p>
     <w:p>
+      <w:pPr>
+        <w:pStyle w:val="ListBullet"/>
+      </w:pPr>
+      <w:r>
+        <w:rPr>
+          <w:highlight w:val="darkGray"/>
+        </w:rPr>
+        <w:t>Dunkelgrau: Erklärungen, aus der bestehenden Lore abgeleitet</w:t>
+      </w:r>
+    </w:p>
+    <w:p>
       <w:r>
         <w:t>Die Markierungen dienen nur der Prüfung. Wo eine Ergänzung doppelt ist, kann sie gestrichen werden. Sind alle geprüft, kann die Markierung entfernt werden – ATLAS liest den Text mit oder ohne Farbe gleich.</w:t>
       </w:r>
@@ -6216,15 +6227,15 @@
         <w:pStyle w:val="Heading4"/>
       </w:pPr>
       <w:r>
-        <w:t>Lupus Noctis / Lupus Mana</w:t>
-      </w:r>
-    </w:p>
-    <w:p>
-      <w:r>
-        <w:rPr>
-          <w:highlight w:val="yellow"/>
-        </w:rPr>
-        <w:t>Ein altes Rudel tritt in verschiedenen Quellen unter beiden Namen auf. Ob Umbenennung, Kanonänderung oder unterschiedliche Bezeichnung, ist offen.</w:t>
+        <w:t>Lupus Mana</w:t>
+      </w:r>
+    </w:p>
+    <w:p>
+      <w:r>
+        <w:rPr>
+          <w:highlight w:val="lightGray"/>
+        </w:rPr>
+        <w:t>Lupus Mana ist der Teil von Lupus Noctis, der nach der Niederlage nicht in die Unterwelt verbannt wurde und in Moonwood Mill blieb. Angeführt wurde er von Hepzibah als Alphawölfin; später erwählte sie Ravik vor den Augen Lucians zu ihrem neuen Gefährten und damit zum Alphawolf. Lupus Mana zählte damals knapp dreissig Wölfe und galt als letzte bekannte Werwolfgesellschaft dieser Welt. Mit Ragnars Rückkehr wurde das Rudel wieder zu Lupus Noctis vereint.</w:t>
       </w:r>
     </w:p>
     <w:p>
@@ -6413,14 +6424,6 @@
     <w:p>
       <w:r>
         <w:t>Durch ein besonderes Artefakt beziehungsweise eine wiederhergestellte Verbindung konnten Überlebende zurückkehren. Das erste erneute Mondlicht stellte ihre Kraft und Verwandlungsfähigkeit schnell wieder her. Die Rückkehr verschärfte den alten Konflikt mit den Vampiren erneut.</w:t>
-      </w:r>
-    </w:p>
-    <w:p>
-      <w:r>
-        <w:rPr>
-          <w:highlight w:val="lightGray"/>
-        </w:rPr>
-        <w:t>Nach der Rückkehr zählte Lupus Noctis knapp dreissig Wölfe.</w:t>
       </w:r>
     </w:p>
     <w:p>
@@ -9266,6 +9269,14 @@
       </w:pPr>
       <w:r>
         <w:t>15.4 Morpidianer einer alternativen Zeitlinie</w:t>
+      </w:r>
+    </w:p>
+    <w:p>
+      <w:r>
+        <w:rPr>
+          <w:highlight w:val="darkGray"/>
+        </w:rPr>
+        <w:t>Morpidianer sind Aliens vom Planeten Morpidia. Ihre bekannte Geschichte spielt in einer alternativen Zeitlinie.</w:t>
       </w:r>
     </w:p>
     <w:p>

</xml_diff>

<commit_message>
lore: drop a sentence that only denied an assumption, and lead with what the council is
</commit_message>
<xml_diff>
--- a/src/atlas/data/lore/Okkult-Lore.docx
+++ b/src/atlas/data/lore/Okkult-Lore.docx
@@ -12,7 +12,7 @@
     </w:p>
     <w:p>
       <w:r>
-        <w:t>SimsForumRPG · Stand 22.09.2026</w:t>
+        <w:t>SimsForumRPG · Stand 23.09.2026</w:t>
       </w:r>
     </w:p>
     <w:p>
@@ -953,7 +953,7 @@
     </w:p>
     <w:p>
       <w:r>
-        <w:t>Transsylvanien besitzt einen umfangreichen Markt für seltene magische und okkulte Zutaten. Dort werden Zutaten und Materialien gehandelt, keine angeborenen Fähigkeiten. Das Angebot kann variieren. Als Währung kann Sim-Blut verwendet werden.</w:t>
+        <w:t>Transsylvanien besitzt einen umfangreichen Markt für seltene magische und okkulte Zutaten. Das Angebot kann variieren. Als Währung kann Sim-Blut verwendet werden.</w:t>
       </w:r>
     </w:p>
     <w:p>
@@ -1401,7 +1401,7 @@
     </w:p>
     <w:p>
       <w:r>
-        <w:t>Der Rat des Gleichgewichts ist eine mächtige magische Organisation, die nicht mit dem Rat der Vampire verwechselt werden darf. Seine Aufgabe ist nicht die Herrschaft über eine einzelne Art, sondern die Stabilität von Magie, Welten und universeller Energie.</w:t>
+        <w:t>Der Rat des Gleichgewichts ist eine mächtige magische Organisation. Seine Aufgabe ist die Stabilität von Magie, Welten und universeller Energie, nicht die Herrschaft über eine einzelne Art. Er ist nicht dasselbe wie der Rat der Vampire in Bloodmoon Valley.</w:t>
       </w:r>
     </w:p>
     <w:p>

</xml_diff>